<commit_message>
Prepared Floatsam Jetsam for realse
</commit_message>
<xml_diff>
--- a/poetry/freeform/flotsam-and-jetsam/a-sunburnt-nose.docx
+++ b/poetry/freeform/flotsam-and-jetsam/a-sunburnt-nose.docx
@@ -94,15 +94,30 @@
     </w:p>
     <w:p>
       <w:r>
-        <w:t xml:space="preserve">I scream for </w:t>
+        <w:t>No ship on the horizon,</w:t>
       </w:r>
-      <w:proofErr w:type="spellStart"/>
       <w:r>
-        <w:t>icecream</w:t>
+        <w:br/>
+        <w:t>let’s just play pretend</w:t>
       </w:r>
-      <w:proofErr w:type="spellEnd"/>
       <w:r>
-        <w:t>,</w:t>
+        <w:br/>
+        <w:t>Look, I’m closing my eyes again</w:t>
+      </w:r>
+      <w:r>
+        <w:br/>
+        <w:t>What do you mean</w:t>
+      </w:r>
+      <w:r>
+        <w:t>—</w:t>
+      </w:r>
+      <w:r>
+        <w:t>"this is a trend?”</w:t>
+      </w:r>
+    </w:p>
+    <w:p>
+      <w:r>
+        <w:t>I scream for icecream,</w:t>
       </w:r>
       <w:r>
         <w:br/>
@@ -954,7 +969,6 @@
   <w:style w:type="character" w:default="1" w:styleId="DefaultParagraphFont">
     <w:name w:val="Default Paragraph Font"/>
     <w:uiPriority w:val="1"/>
-    <w:semiHidden/>
     <w:unhideWhenUsed/>
   </w:style>
   <w:style w:type="table" w:default="1" w:styleId="TableNormal">

</xml_diff>